<commit_message>
feat: Upgrade to 100,000-record clinical dataset with multi-cohort architecture, HbA1c biomarkers, calibrated XGBoost, XAI, and 9-section PDF reporting
</commit_message>
<xml_diff>
--- a/Explainable_AI_Diabetes_Prediction_Project_Report.docx
+++ b/Explainable_AI_Diabetes_Prediction_Project_Report.docx
@@ -476,12 +476,16 @@
           <w:color w:val="0F766E"/>
           <w:sz w:val="32"/>
         </w:rPr>
-        <w:t>4. Dataset Analysis &amp; Preprocessing Methodology</w:t>
+        <w:t>4. Dataset Analysis &amp; Multi-Cohort Preprocessing Methodology</w:t>
       </w:r>
     </w:p>
     <w:p>
       <w:r>
-        <w:t>The project is evaluated on the benchmark PIMA Indians Diabetes Database (National Institute of Diabetes and Digestive and Kidney Diseases). The dataset contains 768 patient records with 8 numerical clinical features and a binary Outcome target.</w:t>
+        <w:t>To address faculty evaluation feedback regarding dataset volume and demographic realism, the architecture integrates a Multi-Cohort structure comparing two clinical cohorts:</w:t>
+        <w:br/>
+        <w:t>1. Primary Clinical Cohort (N = 100,000): A large-scale clinical dataset incorporating global diagnostic gold standards (HbA1c, blood glucose), cardiovascular comorbidities (hypertension, heart disease), lifestyle exposure (smoking status), and balanced demographics (58.6% Female, 41.4% Male).</w:t>
+        <w:br/>
+        <w:t>2. Historical PIMA Indians Benchmark (N = 768): Preserved for comparative cross-cohort verification.</w:t>
       </w:r>
     </w:p>
     <w:p>
@@ -497,7 +501,549 @@
           <w:color w:val="1E293B"/>
           <w:sz w:val="26"/>
         </w:rPr>
-        <w:t>Table 1: Clinical Feature Specifications &amp; Missing-Zero Rationale</w:t>
+        <w:t>Table 1: Cohort Architecture Comparison (PIMA 768 vs. Clinical 100k)</w:t>
+      </w:r>
+    </w:p>
+    <w:tbl>
+      <w:tblPr>
+        <w:tblW w:type="auto" w:w="0"/>
+        <w:jc w:val="center"/>
+        <w:tblLook w:firstColumn="1" w:firstRow="1" w:lastColumn="0" w:lastRow="0" w:noHBand="0" w:noVBand="1" w:val="04A0"/>
+      </w:tblPr>
+      <w:tblGrid>
+        <w:gridCol w:w="3312"/>
+        <w:gridCol w:w="3312"/>
+        <w:gridCol w:w="3312"/>
+      </w:tblGrid>
+      <w:tr>
+        <w:tc>
+          <w:tcPr>
+            <w:tcW w:type="dxa" w:w="2880"/>
+            <w:shd w:fill="0F766E"/>
+            <w:tcMar>
+              <w:top w:w="100" w:type="dxa"/>
+              <w:bottom w:w="100" w:type="dxa"/>
+              <w:left w:w="100" w:type="dxa"/>
+              <w:right w:w="100" w:type="dxa"/>
+            </w:tcMar>
+          </w:tcPr>
+          <w:p>
+            <w:pPr>
+              <w:spacing w:after="0"/>
+            </w:pPr>
+            <w:r>
+              <w:rPr>
+                <w:b/>
+                <w:color w:val="FFFFFF"/>
+                <w:sz w:val="17"/>
+              </w:rPr>
+              <w:t>Dimension</w:t>
+            </w:r>
+          </w:p>
+        </w:tc>
+        <w:tc>
+          <w:tcPr>
+            <w:tcW w:type="dxa" w:w="3168"/>
+            <w:shd w:fill="0F766E"/>
+            <w:tcMar>
+              <w:top w:w="100" w:type="dxa"/>
+              <w:bottom w:w="100" w:type="dxa"/>
+              <w:left w:w="100" w:type="dxa"/>
+              <w:right w:w="100" w:type="dxa"/>
+            </w:tcMar>
+          </w:tcPr>
+          <w:p>
+            <w:pPr>
+              <w:spacing w:after="0"/>
+            </w:pPr>
+            <w:r>
+              <w:rPr>
+                <w:b/>
+                <w:color w:val="FFFFFF"/>
+                <w:sz w:val="17"/>
+              </w:rPr>
+              <w:t>PIMA Indians Benchmark</w:t>
+            </w:r>
+          </w:p>
+        </w:tc>
+        <w:tc>
+          <w:tcPr>
+            <w:tcW w:type="dxa" w:w="4032"/>
+            <w:shd w:fill="0F766E"/>
+            <w:tcMar>
+              <w:top w:w="100" w:type="dxa"/>
+              <w:bottom w:w="100" w:type="dxa"/>
+              <w:left w:w="100" w:type="dxa"/>
+              <w:right w:w="100" w:type="dxa"/>
+            </w:tcMar>
+          </w:tcPr>
+          <w:p>
+            <w:pPr>
+              <w:spacing w:after="0"/>
+            </w:pPr>
+            <w:r>
+              <w:rPr>
+                <w:b/>
+                <w:color w:val="FFFFFF"/>
+                <w:sz w:val="17"/>
+              </w:rPr>
+              <w:t>Clinical 100k Dataset (Upgraded)</w:t>
+            </w:r>
+          </w:p>
+        </w:tc>
+      </w:tr>
+      <w:tr>
+        <w:tc>
+          <w:tcPr>
+            <w:tcW w:type="dxa" w:w="2880"/>
+            <w:shd w:fill="FFFFFF"/>
+            <w:tcMar>
+              <w:top w:w="60" w:type="dxa"/>
+              <w:bottom w:w="60" w:type="dxa"/>
+              <w:left w:w="80" w:type="dxa"/>
+              <w:right w:w="80" w:type="dxa"/>
+            </w:tcMar>
+          </w:tcPr>
+          <w:p>
+            <w:pPr>
+              <w:spacing w:after="0"/>
+            </w:pPr>
+            <w:r>
+              <w:rPr>
+                <w:b/>
+                <w:sz w:val="16"/>
+              </w:rPr>
+              <w:t>Cohort Size (N)</w:t>
+            </w:r>
+          </w:p>
+        </w:tc>
+        <w:tc>
+          <w:tcPr>
+            <w:tcW w:type="dxa" w:w="3168"/>
+            <w:shd w:fill="FFFFFF"/>
+            <w:tcMar>
+              <w:top w:w="60" w:type="dxa"/>
+              <w:bottom w:w="60" w:type="dxa"/>
+              <w:left w:w="80" w:type="dxa"/>
+              <w:right w:w="80" w:type="dxa"/>
+            </w:tcMar>
+          </w:tcPr>
+          <w:p>
+            <w:pPr>
+              <w:spacing w:after="0"/>
+            </w:pPr>
+            <w:r>
+              <w:rPr>
+                <w:sz w:val="16"/>
+              </w:rPr>
+              <w:t>768 records</w:t>
+            </w:r>
+          </w:p>
+        </w:tc>
+        <w:tc>
+          <w:tcPr>
+            <w:tcW w:type="dxa" w:w="4032"/>
+            <w:shd w:fill="FFFFFF"/>
+            <w:tcMar>
+              <w:top w:w="60" w:type="dxa"/>
+              <w:bottom w:w="60" w:type="dxa"/>
+              <w:left w:w="80" w:type="dxa"/>
+              <w:right w:w="80" w:type="dxa"/>
+            </w:tcMar>
+          </w:tcPr>
+          <w:p>
+            <w:pPr>
+              <w:spacing w:after="0"/>
+            </w:pPr>
+            <w:r>
+              <w:rPr>
+                <w:sz w:val="16"/>
+              </w:rPr>
+              <w:t>100,000 records (130x scale increase)</w:t>
+            </w:r>
+          </w:p>
+        </w:tc>
+      </w:tr>
+      <w:tr>
+        <w:tc>
+          <w:tcPr>
+            <w:tcW w:type="dxa" w:w="2880"/>
+            <w:shd w:fill="F8FAFC"/>
+            <w:tcMar>
+              <w:top w:w="60" w:type="dxa"/>
+              <w:bottom w:w="60" w:type="dxa"/>
+              <w:left w:w="80" w:type="dxa"/>
+              <w:right w:w="80" w:type="dxa"/>
+            </w:tcMar>
+          </w:tcPr>
+          <w:p>
+            <w:pPr>
+              <w:spacing w:after="0"/>
+            </w:pPr>
+            <w:r>
+              <w:rPr>
+                <w:b/>
+                <w:sz w:val="16"/>
+              </w:rPr>
+              <w:t>Demographic Coverage</w:t>
+            </w:r>
+          </w:p>
+        </w:tc>
+        <w:tc>
+          <w:tcPr>
+            <w:tcW w:type="dxa" w:w="3168"/>
+            <w:shd w:fill="F8FAFC"/>
+            <w:tcMar>
+              <w:top w:w="60" w:type="dxa"/>
+              <w:bottom w:w="60" w:type="dxa"/>
+              <w:left w:w="80" w:type="dxa"/>
+              <w:right w:w="80" w:type="dxa"/>
+            </w:tcMar>
+          </w:tcPr>
+          <w:p>
+            <w:pPr>
+              <w:spacing w:after="0"/>
+            </w:pPr>
+            <w:r>
+              <w:rPr>
+                <w:sz w:val="16"/>
+              </w:rPr>
+              <w:t>Exclusively Female (100%)</w:t>
+            </w:r>
+          </w:p>
+        </w:tc>
+        <w:tc>
+          <w:tcPr>
+            <w:tcW w:type="dxa" w:w="4032"/>
+            <w:shd w:fill="F8FAFC"/>
+            <w:tcMar>
+              <w:top w:w="60" w:type="dxa"/>
+              <w:bottom w:w="60" w:type="dxa"/>
+              <w:left w:w="80" w:type="dxa"/>
+              <w:right w:w="80" w:type="dxa"/>
+            </w:tcMar>
+          </w:tcPr>
+          <w:p>
+            <w:pPr>
+              <w:spacing w:after="0"/>
+            </w:pPr>
+            <w:r>
+              <w:rPr>
+                <w:sz w:val="16"/>
+              </w:rPr>
+              <w:t>Balanced (58.6% Female, 41.4% Male)</w:t>
+            </w:r>
+          </w:p>
+        </w:tc>
+      </w:tr>
+      <w:tr>
+        <w:tc>
+          <w:tcPr>
+            <w:tcW w:type="dxa" w:w="2880"/>
+            <w:shd w:fill="FFFFFF"/>
+            <w:tcMar>
+              <w:top w:w="60" w:type="dxa"/>
+              <w:bottom w:w="60" w:type="dxa"/>
+              <w:left w:w="80" w:type="dxa"/>
+              <w:right w:w="80" w:type="dxa"/>
+            </w:tcMar>
+          </w:tcPr>
+          <w:p>
+            <w:pPr>
+              <w:spacing w:after="0"/>
+            </w:pPr>
+            <w:r>
+              <w:rPr>
+                <w:b/>
+                <w:sz w:val="16"/>
+              </w:rPr>
+              <w:t>Diagnostic Biomarkers</w:t>
+            </w:r>
+          </w:p>
+        </w:tc>
+        <w:tc>
+          <w:tcPr>
+            <w:tcW w:type="dxa" w:w="3168"/>
+            <w:shd w:fill="FFFFFF"/>
+            <w:tcMar>
+              <w:top w:w="60" w:type="dxa"/>
+              <w:bottom w:w="60" w:type="dxa"/>
+              <w:left w:w="80" w:type="dxa"/>
+              <w:right w:w="80" w:type="dxa"/>
+            </w:tcMar>
+          </w:tcPr>
+          <w:p>
+            <w:pPr>
+              <w:spacing w:after="0"/>
+            </w:pPr>
+            <w:r>
+              <w:rPr>
+                <w:sz w:val="16"/>
+              </w:rPr>
+              <w:t>Glucose, Insulin, Skin Thickness</w:t>
+            </w:r>
+          </w:p>
+        </w:tc>
+        <w:tc>
+          <w:tcPr>
+            <w:tcW w:type="dxa" w:w="4032"/>
+            <w:shd w:fill="FFFFFF"/>
+            <w:tcMar>
+              <w:top w:w="60" w:type="dxa"/>
+              <w:bottom w:w="60" w:type="dxa"/>
+              <w:left w:w="80" w:type="dxa"/>
+              <w:right w:w="80" w:type="dxa"/>
+            </w:tcMar>
+          </w:tcPr>
+          <w:p>
+            <w:pPr>
+              <w:spacing w:after="0"/>
+            </w:pPr>
+            <w:r>
+              <w:rPr>
+                <w:sz w:val="16"/>
+              </w:rPr>
+              <w:t>HbA1c Level (%), Blood Glucose (mg/dL)</w:t>
+            </w:r>
+          </w:p>
+        </w:tc>
+      </w:tr>
+      <w:tr>
+        <w:tc>
+          <w:tcPr>
+            <w:tcW w:type="dxa" w:w="2880"/>
+            <w:shd w:fill="F8FAFC"/>
+            <w:tcMar>
+              <w:top w:w="60" w:type="dxa"/>
+              <w:bottom w:w="60" w:type="dxa"/>
+              <w:left w:w="80" w:type="dxa"/>
+              <w:right w:w="80" w:type="dxa"/>
+            </w:tcMar>
+          </w:tcPr>
+          <w:p>
+            <w:pPr>
+              <w:spacing w:after="0"/>
+            </w:pPr>
+            <w:r>
+              <w:rPr>
+                <w:b/>
+                <w:sz w:val="16"/>
+              </w:rPr>
+              <w:t>Comorbidities</w:t>
+            </w:r>
+          </w:p>
+        </w:tc>
+        <w:tc>
+          <w:tcPr>
+            <w:tcW w:type="dxa" w:w="3168"/>
+            <w:shd w:fill="F8FAFC"/>
+            <w:tcMar>
+              <w:top w:w="60" w:type="dxa"/>
+              <w:bottom w:w="60" w:type="dxa"/>
+              <w:left w:w="80" w:type="dxa"/>
+              <w:right w:w="80" w:type="dxa"/>
+            </w:tcMar>
+          </w:tcPr>
+          <w:p>
+            <w:pPr>
+              <w:spacing w:after="0"/>
+            </w:pPr>
+            <w:r>
+              <w:rPr>
+                <w:sz w:val="16"/>
+              </w:rPr>
+              <w:t>None recorded</w:t>
+            </w:r>
+          </w:p>
+        </w:tc>
+        <w:tc>
+          <w:tcPr>
+            <w:tcW w:type="dxa" w:w="4032"/>
+            <w:shd w:fill="F8FAFC"/>
+            <w:tcMar>
+              <w:top w:w="60" w:type="dxa"/>
+              <w:bottom w:w="60" w:type="dxa"/>
+              <w:left w:w="80" w:type="dxa"/>
+              <w:right w:w="80" w:type="dxa"/>
+            </w:tcMar>
+          </w:tcPr>
+          <w:p>
+            <w:pPr>
+              <w:spacing w:after="0"/>
+            </w:pPr>
+            <w:r>
+              <w:rPr>
+                <w:sz w:val="16"/>
+              </w:rPr>
+              <w:t>Hypertension (0/1), Heart Disease (0/1)</w:t>
+            </w:r>
+          </w:p>
+        </w:tc>
+      </w:tr>
+      <w:tr>
+        <w:tc>
+          <w:tcPr>
+            <w:tcW w:type="dxa" w:w="2880"/>
+            <w:shd w:fill="FFFFFF"/>
+            <w:tcMar>
+              <w:top w:w="60" w:type="dxa"/>
+              <w:bottom w:w="60" w:type="dxa"/>
+              <w:left w:w="80" w:type="dxa"/>
+              <w:right w:w="80" w:type="dxa"/>
+            </w:tcMar>
+          </w:tcPr>
+          <w:p>
+            <w:pPr>
+              <w:spacing w:after="0"/>
+            </w:pPr>
+            <w:r>
+              <w:rPr>
+                <w:b/>
+                <w:sz w:val="16"/>
+              </w:rPr>
+              <w:t>Lifestyle Factors</w:t>
+            </w:r>
+          </w:p>
+        </w:tc>
+        <w:tc>
+          <w:tcPr>
+            <w:tcW w:type="dxa" w:w="3168"/>
+            <w:shd w:fill="FFFFFF"/>
+            <w:tcMar>
+              <w:top w:w="60" w:type="dxa"/>
+              <w:bottom w:w="60" w:type="dxa"/>
+              <w:left w:w="80" w:type="dxa"/>
+              <w:right w:w="80" w:type="dxa"/>
+            </w:tcMar>
+          </w:tcPr>
+          <w:p>
+            <w:pPr>
+              <w:spacing w:after="0"/>
+            </w:pPr>
+            <w:r>
+              <w:rPr>
+                <w:sz w:val="16"/>
+              </w:rPr>
+              <w:t>None recorded</w:t>
+            </w:r>
+          </w:p>
+        </w:tc>
+        <w:tc>
+          <w:tcPr>
+            <w:tcW w:type="dxa" w:w="4032"/>
+            <w:shd w:fill="FFFFFF"/>
+            <w:tcMar>
+              <w:top w:w="60" w:type="dxa"/>
+              <w:bottom w:w="60" w:type="dxa"/>
+              <w:left w:w="80" w:type="dxa"/>
+              <w:right w:w="80" w:type="dxa"/>
+            </w:tcMar>
+          </w:tcPr>
+          <w:p>
+            <w:pPr>
+              <w:spacing w:after="0"/>
+            </w:pPr>
+            <w:r>
+              <w:rPr>
+                <w:sz w:val="16"/>
+              </w:rPr>
+              <w:t>Smoking History (never, former, current, etc.)</w:t>
+            </w:r>
+          </w:p>
+        </w:tc>
+      </w:tr>
+      <w:tr>
+        <w:tc>
+          <w:tcPr>
+            <w:tcW w:type="dxa" w:w="2880"/>
+            <w:shd w:fill="F8FAFC"/>
+            <w:tcMar>
+              <w:top w:w="60" w:type="dxa"/>
+              <w:bottom w:w="60" w:type="dxa"/>
+              <w:left w:w="80" w:type="dxa"/>
+              <w:right w:w="80" w:type="dxa"/>
+            </w:tcMar>
+          </w:tcPr>
+          <w:p>
+            <w:pPr>
+              <w:spacing w:after="0"/>
+            </w:pPr>
+            <w:r>
+              <w:rPr>
+                <w:b/>
+                <w:sz w:val="16"/>
+              </w:rPr>
+              <w:t>Target Imbalance</w:t>
+            </w:r>
+          </w:p>
+        </w:tc>
+        <w:tc>
+          <w:tcPr>
+            <w:tcW w:type="dxa" w:w="3168"/>
+            <w:shd w:fill="F8FAFC"/>
+            <w:tcMar>
+              <w:top w:w="60" w:type="dxa"/>
+              <w:bottom w:w="60" w:type="dxa"/>
+              <w:left w:w="80" w:type="dxa"/>
+              <w:right w:w="80" w:type="dxa"/>
+            </w:tcMar>
+          </w:tcPr>
+          <w:p>
+            <w:pPr>
+              <w:spacing w:after="0"/>
+            </w:pPr>
+            <w:r>
+              <w:rPr>
+                <w:sz w:val="16"/>
+              </w:rPr>
+              <w:t>~35% Diabetic</w:t>
+            </w:r>
+          </w:p>
+        </w:tc>
+        <w:tc>
+          <w:tcPr>
+            <w:tcW w:type="dxa" w:w="4032"/>
+            <w:shd w:fill="F8FAFC"/>
+            <w:tcMar>
+              <w:top w:w="60" w:type="dxa"/>
+              <w:bottom w:w="60" w:type="dxa"/>
+              <w:left w:w="80" w:type="dxa"/>
+              <w:right w:w="80" w:type="dxa"/>
+            </w:tcMar>
+          </w:tcPr>
+          <w:p>
+            <w:pPr>
+              <w:spacing w:after="0"/>
+            </w:pPr>
+            <w:r>
+              <w:rPr>
+                <w:sz w:val="16"/>
+              </w:rPr>
+              <w:t>~8.8% Diabetic (True Population Prevalence)</w:t>
+            </w:r>
+          </w:p>
+        </w:tc>
+      </w:tr>
+    </w:tbl>
+    <w:p>
+      <w:pPr>
+        <w:spacing w:after="160"/>
+      </w:pPr>
+    </w:p>
+    <w:p>
+      <w:pPr>
+        <w:pStyle w:val="Heading2"/>
+        <w:keepNext/>
+        <w:spacing w:before="240" w:after="80"/>
+      </w:pPr>
+      <w:r>
+        <w:rPr>
+          <w:rFonts w:ascii="Calibri" w:hAnsi="Calibri"/>
+          <w:b/>
+          <w:color w:val="1E293B"/>
+          <w:sz w:val="26"/>
+        </w:rPr>
+        <w:t>Table 1B: Clinical Feature Specifications &amp; Missing-Zero Rationale (PIMA)</w:t>
       </w:r>
     </w:p>
     <w:tbl>
@@ -1398,8 +1944,932 @@
     </w:p>
     <w:p>
       <w:r>
-        <w:t>To establish rigorous baseline comparisons, five algorithms were benchmarked using identical leak-free 5-fold Stratified Cross-Validation on the training cohort (N=614):</w:t>
+        <w:t>To establish rigorous baseline comparisons, candidate algorithms were benchmarked under identical leak-free conditions across both the 100k Clinical Cohort and the historical PIMA benchmark.</w:t>
       </w:r>
+    </w:p>
+    <w:p>
+      <w:pPr>
+        <w:pStyle w:val="Heading2"/>
+        <w:keepNext/>
+        <w:spacing w:before="240" w:after="80"/>
+      </w:pPr>
+      <w:r>
+        <w:rPr>
+          <w:rFonts w:ascii="Calibri" w:hAnsi="Calibri"/>
+          <w:b/>
+          <w:color w:val="1E293B"/>
+          <w:sz w:val="26"/>
+        </w:rPr>
+        <w:t>Table 2: 100,000-Record Clinical Cohort Holdout Benchmark (N=19,226)</w:t>
+      </w:r>
+    </w:p>
+    <w:tbl>
+      <w:tblPr>
+        <w:tblW w:type="auto" w:w="0"/>
+        <w:jc w:val="center"/>
+        <w:tblLook w:firstColumn="1" w:firstRow="1" w:lastColumn="0" w:lastRow="0" w:noHBand="0" w:noVBand="1" w:val="04A0"/>
+      </w:tblPr>
+      <w:tblGrid>
+        <w:gridCol w:w="1656"/>
+        <w:gridCol w:w="1656"/>
+        <w:gridCol w:w="1656"/>
+        <w:gridCol w:w="1656"/>
+        <w:gridCol w:w="1656"/>
+        <w:gridCol w:w="1656"/>
+      </w:tblGrid>
+      <w:tr>
+        <w:tc>
+          <w:tcPr>
+            <w:tcW w:type="dxa" w:w="2880"/>
+            <w:shd w:fill="0F766E"/>
+            <w:tcMar>
+              <w:top w:w="100" w:type="dxa"/>
+              <w:bottom w:w="100" w:type="dxa"/>
+              <w:left w:w="100" w:type="dxa"/>
+              <w:right w:w="100" w:type="dxa"/>
+            </w:tcMar>
+          </w:tcPr>
+          <w:p>
+            <w:pPr>
+              <w:spacing w:after="0"/>
+            </w:pPr>
+            <w:r>
+              <w:rPr>
+                <w:b/>
+                <w:color w:val="FFFFFF"/>
+                <w:sz w:val="17"/>
+              </w:rPr>
+              <w:t>Algorithm Evaluated</w:t>
+            </w:r>
+          </w:p>
+        </w:tc>
+        <w:tc>
+          <w:tcPr>
+            <w:tcW w:type="dxa" w:w="1440"/>
+            <w:shd w:fill="0F766E"/>
+            <w:tcMar>
+              <w:top w:w="100" w:type="dxa"/>
+              <w:bottom w:w="100" w:type="dxa"/>
+              <w:left w:w="100" w:type="dxa"/>
+              <w:right w:w="100" w:type="dxa"/>
+            </w:tcMar>
+          </w:tcPr>
+          <w:p>
+            <w:pPr>
+              <w:spacing w:after="0"/>
+            </w:pPr>
+            <w:r>
+              <w:rPr>
+                <w:b/>
+                <w:color w:val="FFFFFF"/>
+                <w:sz w:val="17"/>
+              </w:rPr>
+              <w:t>Accuracy</w:t>
+            </w:r>
+          </w:p>
+        </w:tc>
+        <w:tc>
+          <w:tcPr>
+            <w:tcW w:type="dxa" w:w="1440"/>
+            <w:shd w:fill="0F766E"/>
+            <w:tcMar>
+              <w:top w:w="100" w:type="dxa"/>
+              <w:bottom w:w="100" w:type="dxa"/>
+              <w:left w:w="100" w:type="dxa"/>
+              <w:right w:w="100" w:type="dxa"/>
+            </w:tcMar>
+          </w:tcPr>
+          <w:p>
+            <w:pPr>
+              <w:spacing w:after="0"/>
+            </w:pPr>
+            <w:r>
+              <w:rPr>
+                <w:b/>
+                <w:color w:val="FFFFFF"/>
+                <w:sz w:val="17"/>
+              </w:rPr>
+              <w:t>Precision</w:t>
+            </w:r>
+          </w:p>
+        </w:tc>
+        <w:tc>
+          <w:tcPr>
+            <w:tcW w:type="dxa" w:w="1440"/>
+            <w:shd w:fill="0F766E"/>
+            <w:tcMar>
+              <w:top w:w="100" w:type="dxa"/>
+              <w:bottom w:w="100" w:type="dxa"/>
+              <w:left w:w="100" w:type="dxa"/>
+              <w:right w:w="100" w:type="dxa"/>
+            </w:tcMar>
+          </w:tcPr>
+          <w:p>
+            <w:pPr>
+              <w:spacing w:after="0"/>
+            </w:pPr>
+            <w:r>
+              <w:rPr>
+                <w:b/>
+                <w:color w:val="FFFFFF"/>
+                <w:sz w:val="17"/>
+              </w:rPr>
+              <w:t>Recall</w:t>
+            </w:r>
+          </w:p>
+        </w:tc>
+        <w:tc>
+          <w:tcPr>
+            <w:tcW w:type="dxa" w:w="1440"/>
+            <w:shd w:fill="0F766E"/>
+            <w:tcMar>
+              <w:top w:w="100" w:type="dxa"/>
+              <w:bottom w:w="100" w:type="dxa"/>
+              <w:left w:w="100" w:type="dxa"/>
+              <w:right w:w="100" w:type="dxa"/>
+            </w:tcMar>
+          </w:tcPr>
+          <w:p>
+            <w:pPr>
+              <w:spacing w:after="0"/>
+            </w:pPr>
+            <w:r>
+              <w:rPr>
+                <w:b/>
+                <w:color w:val="FFFFFF"/>
+                <w:sz w:val="17"/>
+              </w:rPr>
+              <w:t>F1 Score</w:t>
+            </w:r>
+          </w:p>
+        </w:tc>
+        <w:tc>
+          <w:tcPr>
+            <w:tcW w:type="dxa" w:w="1440"/>
+            <w:shd w:fill="0F766E"/>
+            <w:tcMar>
+              <w:top w:w="100" w:type="dxa"/>
+              <w:bottom w:w="100" w:type="dxa"/>
+              <w:left w:w="100" w:type="dxa"/>
+              <w:right w:w="100" w:type="dxa"/>
+            </w:tcMar>
+          </w:tcPr>
+          <w:p>
+            <w:pPr>
+              <w:spacing w:after="0"/>
+            </w:pPr>
+            <w:r>
+              <w:rPr>
+                <w:b/>
+                <w:color w:val="FFFFFF"/>
+                <w:sz w:val="17"/>
+              </w:rPr>
+              <w:t>ROC-AUC</w:t>
+            </w:r>
+          </w:p>
+        </w:tc>
+      </w:tr>
+      <w:tr>
+        <w:tc>
+          <w:tcPr>
+            <w:tcW w:type="dxa" w:w="2880"/>
+            <w:shd w:fill="FFFFFF"/>
+            <w:tcMar>
+              <w:top w:w="60" w:type="dxa"/>
+              <w:bottom w:w="60" w:type="dxa"/>
+              <w:left w:w="80" w:type="dxa"/>
+              <w:right w:w="80" w:type="dxa"/>
+            </w:tcMar>
+          </w:tcPr>
+          <w:p>
+            <w:pPr>
+              <w:spacing w:after="0"/>
+            </w:pPr>
+            <w:r>
+              <w:rPr>
+                <w:b/>
+                <w:sz w:val="16"/>
+              </w:rPr>
+              <w:t>XGBoost (Primary)</w:t>
+            </w:r>
+          </w:p>
+        </w:tc>
+        <w:tc>
+          <w:tcPr>
+            <w:tcW w:type="dxa" w:w="1440"/>
+            <w:shd w:fill="FFFFFF"/>
+            <w:tcMar>
+              <w:top w:w="60" w:type="dxa"/>
+              <w:bottom w:w="60" w:type="dxa"/>
+              <w:left w:w="80" w:type="dxa"/>
+              <w:right w:w="80" w:type="dxa"/>
+            </w:tcMar>
+          </w:tcPr>
+          <w:p>
+            <w:pPr>
+              <w:spacing w:after="0"/>
+            </w:pPr>
+            <w:r>
+              <w:rPr>
+                <w:sz w:val="16"/>
+              </w:rPr>
+              <w:t>97.20%</w:t>
+            </w:r>
+          </w:p>
+        </w:tc>
+        <w:tc>
+          <w:tcPr>
+            <w:tcW w:type="dxa" w:w="1440"/>
+            <w:shd w:fill="FFFFFF"/>
+            <w:tcMar>
+              <w:top w:w="60" w:type="dxa"/>
+              <w:bottom w:w="60" w:type="dxa"/>
+              <w:left w:w="80" w:type="dxa"/>
+              <w:right w:w="80" w:type="dxa"/>
+            </w:tcMar>
+          </w:tcPr>
+          <w:p>
+            <w:pPr>
+              <w:spacing w:after="0"/>
+            </w:pPr>
+            <w:r>
+              <w:rPr>
+                <w:sz w:val="16"/>
+              </w:rPr>
+              <w:t>98.82%</w:t>
+            </w:r>
+          </w:p>
+        </w:tc>
+        <w:tc>
+          <w:tcPr>
+            <w:tcW w:type="dxa" w:w="1440"/>
+            <w:shd w:fill="FFFFFF"/>
+            <w:tcMar>
+              <w:top w:w="60" w:type="dxa"/>
+              <w:bottom w:w="60" w:type="dxa"/>
+              <w:left w:w="80" w:type="dxa"/>
+              <w:right w:w="80" w:type="dxa"/>
+            </w:tcMar>
+          </w:tcPr>
+          <w:p>
+            <w:pPr>
+              <w:spacing w:after="0"/>
+            </w:pPr>
+            <w:r>
+              <w:rPr>
+                <w:sz w:val="16"/>
+              </w:rPr>
+              <w:t>69.10%</w:t>
+            </w:r>
+          </w:p>
+        </w:tc>
+        <w:tc>
+          <w:tcPr>
+            <w:tcW w:type="dxa" w:w="1440"/>
+            <w:shd w:fill="FFFFFF"/>
+            <w:tcMar>
+              <w:top w:w="60" w:type="dxa"/>
+              <w:bottom w:w="60" w:type="dxa"/>
+              <w:left w:w="80" w:type="dxa"/>
+              <w:right w:w="80" w:type="dxa"/>
+            </w:tcMar>
+          </w:tcPr>
+          <w:p>
+            <w:pPr>
+              <w:spacing w:after="0"/>
+            </w:pPr>
+            <w:r>
+              <w:rPr>
+                <w:sz w:val="16"/>
+              </w:rPr>
+              <w:t>0.8133</w:t>
+            </w:r>
+          </w:p>
+        </w:tc>
+        <w:tc>
+          <w:tcPr>
+            <w:tcW w:type="dxa" w:w="1440"/>
+            <w:shd w:fill="FFFFFF"/>
+            <w:tcMar>
+              <w:top w:w="60" w:type="dxa"/>
+              <w:bottom w:w="60" w:type="dxa"/>
+              <w:left w:w="80" w:type="dxa"/>
+              <w:right w:w="80" w:type="dxa"/>
+            </w:tcMar>
+          </w:tcPr>
+          <w:p>
+            <w:pPr>
+              <w:spacing w:after="0"/>
+            </w:pPr>
+            <w:r>
+              <w:rPr>
+                <w:sz w:val="16"/>
+              </w:rPr>
+              <w:t>0.9770</w:t>
+            </w:r>
+          </w:p>
+        </w:tc>
+      </w:tr>
+      <w:tr>
+        <w:tc>
+          <w:tcPr>
+            <w:tcW w:type="dxa" w:w="2880"/>
+            <w:shd w:fill="F8FAFC"/>
+            <w:tcMar>
+              <w:top w:w="60" w:type="dxa"/>
+              <w:bottom w:w="60" w:type="dxa"/>
+              <w:left w:w="80" w:type="dxa"/>
+              <w:right w:w="80" w:type="dxa"/>
+            </w:tcMar>
+          </w:tcPr>
+          <w:p>
+            <w:pPr>
+              <w:spacing w:after="0"/>
+            </w:pPr>
+            <w:r>
+              <w:rPr>
+                <w:b/>
+                <w:sz w:val="16"/>
+              </w:rPr>
+              <w:t>XGBoost (Calibrated)</w:t>
+            </w:r>
+          </w:p>
+        </w:tc>
+        <w:tc>
+          <w:tcPr>
+            <w:tcW w:type="dxa" w:w="1440"/>
+            <w:shd w:fill="F8FAFC"/>
+            <w:tcMar>
+              <w:top w:w="60" w:type="dxa"/>
+              <w:bottom w:w="60" w:type="dxa"/>
+              <w:left w:w="80" w:type="dxa"/>
+              <w:right w:w="80" w:type="dxa"/>
+            </w:tcMar>
+          </w:tcPr>
+          <w:p>
+            <w:pPr>
+              <w:spacing w:after="0"/>
+            </w:pPr>
+            <w:r>
+              <w:rPr>
+                <w:sz w:val="16"/>
+              </w:rPr>
+              <w:t>96.88%</w:t>
+            </w:r>
+          </w:p>
+        </w:tc>
+        <w:tc>
+          <w:tcPr>
+            <w:tcW w:type="dxa" w:w="1440"/>
+            <w:shd w:fill="F8FAFC"/>
+            <w:tcMar>
+              <w:top w:w="60" w:type="dxa"/>
+              <w:bottom w:w="60" w:type="dxa"/>
+              <w:left w:w="80" w:type="dxa"/>
+              <w:right w:w="80" w:type="dxa"/>
+            </w:tcMar>
+          </w:tcPr>
+          <w:p>
+            <w:pPr>
+              <w:spacing w:after="0"/>
+            </w:pPr>
+            <w:r>
+              <w:rPr>
+                <w:sz w:val="16"/>
+              </w:rPr>
+              <w:t>91.27%</w:t>
+            </w:r>
+          </w:p>
+        </w:tc>
+        <w:tc>
+          <w:tcPr>
+            <w:tcW w:type="dxa" w:w="1440"/>
+            <w:shd w:fill="F8FAFC"/>
+            <w:tcMar>
+              <w:top w:w="60" w:type="dxa"/>
+              <w:bottom w:w="60" w:type="dxa"/>
+              <w:left w:w="80" w:type="dxa"/>
+              <w:right w:w="80" w:type="dxa"/>
+            </w:tcMar>
+          </w:tcPr>
+          <w:p>
+            <w:pPr>
+              <w:spacing w:after="0"/>
+            </w:pPr>
+            <w:r>
+              <w:rPr>
+                <w:sz w:val="16"/>
+              </w:rPr>
+              <w:t>71.52%</w:t>
+            </w:r>
+          </w:p>
+        </w:tc>
+        <w:tc>
+          <w:tcPr>
+            <w:tcW w:type="dxa" w:w="1440"/>
+            <w:shd w:fill="F8FAFC"/>
+            <w:tcMar>
+              <w:top w:w="60" w:type="dxa"/>
+              <w:bottom w:w="60" w:type="dxa"/>
+              <w:left w:w="80" w:type="dxa"/>
+              <w:right w:w="80" w:type="dxa"/>
+            </w:tcMar>
+          </w:tcPr>
+          <w:p>
+            <w:pPr>
+              <w:spacing w:after="0"/>
+            </w:pPr>
+            <w:r>
+              <w:rPr>
+                <w:sz w:val="16"/>
+              </w:rPr>
+              <w:t>0.8020</w:t>
+            </w:r>
+          </w:p>
+        </w:tc>
+        <w:tc>
+          <w:tcPr>
+            <w:tcW w:type="dxa" w:w="1440"/>
+            <w:shd w:fill="F8FAFC"/>
+            <w:tcMar>
+              <w:top w:w="60" w:type="dxa"/>
+              <w:bottom w:w="60" w:type="dxa"/>
+              <w:left w:w="80" w:type="dxa"/>
+              <w:right w:w="80" w:type="dxa"/>
+            </w:tcMar>
+          </w:tcPr>
+          <w:p>
+            <w:pPr>
+              <w:spacing w:after="0"/>
+            </w:pPr>
+            <w:r>
+              <w:rPr>
+                <w:sz w:val="16"/>
+              </w:rPr>
+              <w:t>0.9770</w:t>
+            </w:r>
+          </w:p>
+        </w:tc>
+      </w:tr>
+      <w:tr>
+        <w:tc>
+          <w:tcPr>
+            <w:tcW w:type="dxa" w:w="2880"/>
+            <w:shd w:fill="FFFFFF"/>
+            <w:tcMar>
+              <w:top w:w="60" w:type="dxa"/>
+              <w:bottom w:w="60" w:type="dxa"/>
+              <w:left w:w="80" w:type="dxa"/>
+              <w:right w:w="80" w:type="dxa"/>
+            </w:tcMar>
+          </w:tcPr>
+          <w:p>
+            <w:pPr>
+              <w:spacing w:after="0"/>
+            </w:pPr>
+            <w:r>
+              <w:rPr>
+                <w:b/>
+                <w:sz w:val="16"/>
+              </w:rPr>
+              <w:t>Random Forest</w:t>
+            </w:r>
+          </w:p>
+        </w:tc>
+        <w:tc>
+          <w:tcPr>
+            <w:tcW w:type="dxa" w:w="1440"/>
+            <w:shd w:fill="FFFFFF"/>
+            <w:tcMar>
+              <w:top w:w="60" w:type="dxa"/>
+              <w:bottom w:w="60" w:type="dxa"/>
+              <w:left w:w="80" w:type="dxa"/>
+              <w:right w:w="80" w:type="dxa"/>
+            </w:tcMar>
+          </w:tcPr>
+          <w:p>
+            <w:pPr>
+              <w:spacing w:after="0"/>
+            </w:pPr>
+            <w:r>
+              <w:rPr>
+                <w:sz w:val="16"/>
+              </w:rPr>
+              <w:t>97.18%</w:t>
+            </w:r>
+          </w:p>
+        </w:tc>
+        <w:tc>
+          <w:tcPr>
+            <w:tcW w:type="dxa" w:w="1440"/>
+            <w:shd w:fill="FFFFFF"/>
+            <w:tcMar>
+              <w:top w:w="60" w:type="dxa"/>
+              <w:bottom w:w="60" w:type="dxa"/>
+              <w:left w:w="80" w:type="dxa"/>
+              <w:right w:w="80" w:type="dxa"/>
+            </w:tcMar>
+          </w:tcPr>
+          <w:p>
+            <w:pPr>
+              <w:spacing w:after="0"/>
+            </w:pPr>
+            <w:r>
+              <w:rPr>
+                <w:sz w:val="16"/>
+              </w:rPr>
+              <w:t>100.00%</w:t>
+            </w:r>
+          </w:p>
+        </w:tc>
+        <w:tc>
+          <w:tcPr>
+            <w:tcW w:type="dxa" w:w="1440"/>
+            <w:shd w:fill="FFFFFF"/>
+            <w:tcMar>
+              <w:top w:w="60" w:type="dxa"/>
+              <w:bottom w:w="60" w:type="dxa"/>
+              <w:left w:w="80" w:type="dxa"/>
+              <w:right w:w="80" w:type="dxa"/>
+            </w:tcMar>
+          </w:tcPr>
+          <w:p>
+            <w:pPr>
+              <w:spacing w:after="0"/>
+            </w:pPr>
+            <w:r>
+              <w:rPr>
+                <w:sz w:val="16"/>
+              </w:rPr>
+              <w:t>68.04%</w:t>
+            </w:r>
+          </w:p>
+        </w:tc>
+        <w:tc>
+          <w:tcPr>
+            <w:tcW w:type="dxa" w:w="1440"/>
+            <w:shd w:fill="FFFFFF"/>
+            <w:tcMar>
+              <w:top w:w="60" w:type="dxa"/>
+              <w:bottom w:w="60" w:type="dxa"/>
+              <w:left w:w="80" w:type="dxa"/>
+              <w:right w:w="80" w:type="dxa"/>
+            </w:tcMar>
+          </w:tcPr>
+          <w:p>
+            <w:pPr>
+              <w:spacing w:after="0"/>
+            </w:pPr>
+            <w:r>
+              <w:rPr>
+                <w:sz w:val="16"/>
+              </w:rPr>
+              <w:t>0.8098</w:t>
+            </w:r>
+          </w:p>
+        </w:tc>
+        <w:tc>
+          <w:tcPr>
+            <w:tcW w:type="dxa" w:w="1440"/>
+            <w:shd w:fill="FFFFFF"/>
+            <w:tcMar>
+              <w:top w:w="60" w:type="dxa"/>
+              <w:bottom w:w="60" w:type="dxa"/>
+              <w:left w:w="80" w:type="dxa"/>
+              <w:right w:w="80" w:type="dxa"/>
+            </w:tcMar>
+          </w:tcPr>
+          <w:p>
+            <w:pPr>
+              <w:spacing w:after="0"/>
+            </w:pPr>
+            <w:r>
+              <w:rPr>
+                <w:sz w:val="16"/>
+              </w:rPr>
+              <w:t>0.9694</w:t>
+            </w:r>
+          </w:p>
+        </w:tc>
+      </w:tr>
+      <w:tr>
+        <w:tc>
+          <w:tcPr>
+            <w:tcW w:type="dxa" w:w="2880"/>
+            <w:shd w:fill="F8FAFC"/>
+            <w:tcMar>
+              <w:top w:w="60" w:type="dxa"/>
+              <w:bottom w:w="60" w:type="dxa"/>
+              <w:left w:w="80" w:type="dxa"/>
+              <w:right w:w="80" w:type="dxa"/>
+            </w:tcMar>
+          </w:tcPr>
+          <w:p>
+            <w:pPr>
+              <w:spacing w:after="0"/>
+            </w:pPr>
+            <w:r>
+              <w:rPr>
+                <w:b/>
+                <w:sz w:val="16"/>
+              </w:rPr>
+              <w:t>Logistic Regression</w:t>
+            </w:r>
+          </w:p>
+        </w:tc>
+        <w:tc>
+          <w:tcPr>
+            <w:tcW w:type="dxa" w:w="1440"/>
+            <w:shd w:fill="F8FAFC"/>
+            <w:tcMar>
+              <w:top w:w="60" w:type="dxa"/>
+              <w:bottom w:w="60" w:type="dxa"/>
+              <w:left w:w="80" w:type="dxa"/>
+              <w:right w:w="80" w:type="dxa"/>
+            </w:tcMar>
+          </w:tcPr>
+          <w:p>
+            <w:pPr>
+              <w:spacing w:after="0"/>
+            </w:pPr>
+            <w:r>
+              <w:rPr>
+                <w:sz w:val="16"/>
+              </w:rPr>
+              <w:t>95.81%</w:t>
+            </w:r>
+          </w:p>
+        </w:tc>
+        <w:tc>
+          <w:tcPr>
+            <w:tcW w:type="dxa" w:w="1440"/>
+            <w:shd w:fill="F8FAFC"/>
+            <w:tcMar>
+              <w:top w:w="60" w:type="dxa"/>
+              <w:bottom w:w="60" w:type="dxa"/>
+              <w:left w:w="80" w:type="dxa"/>
+              <w:right w:w="80" w:type="dxa"/>
+            </w:tcMar>
+          </w:tcPr>
+          <w:p>
+            <w:pPr>
+              <w:spacing w:after="0"/>
+            </w:pPr>
+            <w:r>
+              <w:rPr>
+                <w:sz w:val="16"/>
+              </w:rPr>
+              <w:t>85.32%</w:t>
+            </w:r>
+          </w:p>
+        </w:tc>
+        <w:tc>
+          <w:tcPr>
+            <w:tcW w:type="dxa" w:w="1440"/>
+            <w:shd w:fill="F8FAFC"/>
+            <w:tcMar>
+              <w:top w:w="60" w:type="dxa"/>
+              <w:bottom w:w="60" w:type="dxa"/>
+              <w:left w:w="80" w:type="dxa"/>
+              <w:right w:w="80" w:type="dxa"/>
+            </w:tcMar>
+          </w:tcPr>
+          <w:p>
+            <w:pPr>
+              <w:spacing w:after="0"/>
+            </w:pPr>
+            <w:r>
+              <w:rPr>
+                <w:sz w:val="16"/>
+              </w:rPr>
+              <w:t>63.38%</w:t>
+            </w:r>
+          </w:p>
+        </w:tc>
+        <w:tc>
+          <w:tcPr>
+            <w:tcW w:type="dxa" w:w="1440"/>
+            <w:shd w:fill="F8FAFC"/>
+            <w:tcMar>
+              <w:top w:w="60" w:type="dxa"/>
+              <w:bottom w:w="60" w:type="dxa"/>
+              <w:left w:w="80" w:type="dxa"/>
+              <w:right w:w="80" w:type="dxa"/>
+            </w:tcMar>
+          </w:tcPr>
+          <w:p>
+            <w:pPr>
+              <w:spacing w:after="0"/>
+            </w:pPr>
+            <w:r>
+              <w:rPr>
+                <w:sz w:val="16"/>
+              </w:rPr>
+              <w:t>0.7273</w:t>
+            </w:r>
+          </w:p>
+        </w:tc>
+        <w:tc>
+          <w:tcPr>
+            <w:tcW w:type="dxa" w:w="1440"/>
+            <w:shd w:fill="F8FAFC"/>
+            <w:tcMar>
+              <w:top w:w="60" w:type="dxa"/>
+              <w:bottom w:w="60" w:type="dxa"/>
+              <w:left w:w="80" w:type="dxa"/>
+              <w:right w:w="80" w:type="dxa"/>
+            </w:tcMar>
+          </w:tcPr>
+          <w:p>
+            <w:pPr>
+              <w:spacing w:after="0"/>
+            </w:pPr>
+            <w:r>
+              <w:rPr>
+                <w:sz w:val="16"/>
+              </w:rPr>
+              <w:t>0.9593</w:t>
+            </w:r>
+          </w:p>
+        </w:tc>
+      </w:tr>
+    </w:tbl>
+    <w:p>
+      <w:pPr>
+        <w:spacing w:after="120"/>
+      </w:pPr>
+    </w:p>
+    <w:p>
+      <w:pPr>
+        <w:pStyle w:val="Heading2"/>
+        <w:keepNext/>
+        <w:spacing w:before="240" w:after="80"/>
+      </w:pPr>
+      <w:r>
+        <w:rPr>
+          <w:rFonts w:ascii="Calibri" w:hAnsi="Calibri"/>
+          <w:b/>
+          <w:color w:val="1E293B"/>
+          <w:sz w:val="26"/>
+        </w:rPr>
+        <w:t>Diagnostic Figures: 100k Cohort Performance</w:t>
+      </w:r>
+    </w:p>
+    <w:p>
+      <w:pPr>
+        <w:jc w:val="center"/>
+      </w:pPr>
+      <w:r>
+        <w:drawing>
+          <wp:inline xmlns:a="http://schemas.openxmlformats.org/drawingml/2006/main" xmlns:pic="http://schemas.openxmlformats.org/drawingml/2006/picture">
+            <wp:extent cx="5120640" cy="4267200"/>
+            <wp:docPr id="1" name="Picture 1"/>
+            <wp:cNvGraphicFramePr>
+              <a:graphicFrameLocks noChangeAspect="1"/>
+            </wp:cNvGraphicFramePr>
+            <a:graphic>
+              <a:graphicData uri="http://schemas.openxmlformats.org/drawingml/2006/picture">
+                <pic:pic>
+                  <pic:nvPicPr>
+                    <pic:cNvPr id="0" name="roc_curve_100k.png"/>
+                    <pic:cNvPicPr/>
+                  </pic:nvPicPr>
+                  <pic:blipFill>
+                    <a:blip r:embed="rId9"/>
+                    <a:stretch>
+                      <a:fillRect/>
+                    </a:stretch>
+                  </pic:blipFill>
+                  <pic:spPr>
+                    <a:xfrm>
+                      <a:off x="0" y="0"/>
+                      <a:ext cx="5120640" cy="4267200"/>
+                    </a:xfrm>
+                    <a:prstGeom prst="rect"/>
+                  </pic:spPr>
+                </pic:pic>
+              </a:graphicData>
+            </a:graphic>
+          </wp:inline>
+        </w:drawing>
+      </w:r>
+    </w:p>
+    <w:p>
+      <w:pPr>
+        <w:jc w:val="center"/>
+      </w:pPr>
+      <w:r>
+        <w:t>Figure 1: Receiver Operating Characteristic (ROC) curve on 100k holdout test set (AUC = 0.9770).</w:t>
+      </w:r>
+    </w:p>
+    <w:p>
+      <w:pPr>
+        <w:spacing w:after="120"/>
+      </w:pPr>
+    </w:p>
+    <w:p>
+      <w:pPr>
+        <w:jc w:val="center"/>
+      </w:pPr>
+      <w:r>
+        <w:drawing>
+          <wp:inline xmlns:a="http://schemas.openxmlformats.org/drawingml/2006/main" xmlns:pic="http://schemas.openxmlformats.org/drawingml/2006/picture">
+            <wp:extent cx="5303520" cy="3614644"/>
+            <wp:docPr id="2" name="Picture 2"/>
+            <wp:cNvGraphicFramePr>
+              <a:graphicFrameLocks noChangeAspect="1"/>
+            </wp:cNvGraphicFramePr>
+            <a:graphic>
+              <a:graphicData uri="http://schemas.openxmlformats.org/drawingml/2006/picture">
+                <pic:pic>
+                  <pic:nvPicPr>
+                    <pic:cNvPr id="0" name="shap_summary_100k.png"/>
+                    <pic:cNvPicPr/>
+                  </pic:nvPicPr>
+                  <pic:blipFill>
+                    <a:blip r:embed="rId10"/>
+                    <a:stretch>
+                      <a:fillRect/>
+                    </a:stretch>
+                  </pic:blipFill>
+                  <pic:spPr>
+                    <a:xfrm>
+                      <a:off x="0" y="0"/>
+                      <a:ext cx="5303520" cy="3614644"/>
+                    </a:xfrm>
+                    <a:prstGeom prst="rect"/>
+                  </pic:spPr>
+                </pic:pic>
+              </a:graphicData>
+            </a:graphic>
+          </wp:inline>
+        </w:drawing>
+      </w:r>
+    </w:p>
+    <w:p>
+      <w:pPr>
+        <w:jc w:val="center"/>
+      </w:pPr>
+      <w:r>
+        <w:t>Figure 2: Global SHAP feature attribution beeswarm on 100k Clinical Cohort (HbA1c &amp; Blood Glucose dominant).</w:t>
+      </w:r>
+    </w:p>
+    <w:p>
+      <w:pPr>
+        <w:spacing w:after="120"/>
+      </w:pPr>
+    </w:p>
+    <w:p>
+      <w:pPr>
+        <w:jc w:val="center"/>
+      </w:pPr>
+      <w:r>
+        <w:drawing>
+          <wp:inline xmlns:a="http://schemas.openxmlformats.org/drawingml/2006/main" xmlns:pic="http://schemas.openxmlformats.org/drawingml/2006/picture">
+            <wp:extent cx="4937760" cy="3291840"/>
+            <wp:docPr id="3" name="Picture 3"/>
+            <wp:cNvGraphicFramePr>
+              <a:graphicFrameLocks noChangeAspect="1"/>
+            </wp:cNvGraphicFramePr>
+            <a:graphic>
+              <a:graphicData uri="http://schemas.openxmlformats.org/drawingml/2006/picture">
+                <pic:pic>
+                  <pic:nvPicPr>
+                    <pic:cNvPr id="0" name="sensitivity_hba1c_100k.png"/>
+                    <pic:cNvPicPr/>
+                  </pic:nvPicPr>
+                  <pic:blipFill>
+                    <a:blip r:embed="rId11"/>
+                    <a:stretch>
+                      <a:fillRect/>
+                    </a:stretch>
+                  </pic:blipFill>
+                  <pic:spPr>
+                    <a:xfrm>
+                      <a:off x="0" y="0"/>
+                      <a:ext cx="4937760" cy="3291840"/>
+                    </a:xfrm>
+                    <a:prstGeom prst="rect"/>
+                  </pic:spPr>
+                </pic:pic>
+              </a:graphicData>
+            </a:graphic>
+          </wp:inline>
+        </w:drawing>
+      </w:r>
+    </w:p>
+    <w:p>
+      <w:pPr>
+        <w:jc w:val="center"/>
+      </w:pPr>
+      <w:r>
+        <w:t>Figure 3: OAT Sensitivity sweep for HbA1c confirming monotonic risk trajectory across ADA diagnostic thresholds.</w:t>
+      </w:r>
+    </w:p>
+    <w:p>
+      <w:pPr>
+        <w:spacing w:after="120"/>
+      </w:pPr>
     </w:p>
     <w:p>
       <w:pPr>
@@ -3176,7 +4646,7 @@
         <w:drawing>
           <wp:inline xmlns:a="http://schemas.openxmlformats.org/drawingml/2006/main" xmlns:pic="http://schemas.openxmlformats.org/drawingml/2006/picture">
             <wp:extent cx="5303520" cy="3977640"/>
-            <wp:docPr id="1" name="Picture 1"/>
+            <wp:docPr id="4" name="Picture 4"/>
             <wp:cNvGraphicFramePr>
               <a:graphicFrameLocks noChangeAspect="1"/>
             </wp:cNvGraphicFramePr>
@@ -3188,7 +4658,7 @@
                     <pic:cNvPicPr/>
                   </pic:nvPicPr>
                   <pic:blipFill>
-                    <a:blip r:embed="rId9"/>
+                    <a:blip r:embed="rId12"/>
                     <a:stretch>
                       <a:fillRect/>
                     </a:stretch>
@@ -3249,7 +4719,7 @@
         <w:drawing>
           <wp:inline xmlns:a="http://schemas.openxmlformats.org/drawingml/2006/main" xmlns:pic="http://schemas.openxmlformats.org/drawingml/2006/picture">
             <wp:extent cx="5303520" cy="3157078"/>
-            <wp:docPr id="2" name="Picture 2"/>
+            <wp:docPr id="5" name="Picture 5"/>
             <wp:cNvGraphicFramePr>
               <a:graphicFrameLocks noChangeAspect="1"/>
             </wp:cNvGraphicFramePr>
@@ -3261,7 +4731,7 @@
                     <pic:cNvPicPr/>
                   </pic:nvPicPr>
                   <pic:blipFill>
-                    <a:blip r:embed="rId10"/>
+                    <a:blip r:embed="rId13"/>
                     <a:stretch>
                       <a:fillRect/>
                     </a:stretch>
@@ -3301,7 +4771,7 @@
         <w:drawing>
           <wp:inline xmlns:a="http://schemas.openxmlformats.org/drawingml/2006/main" xmlns:pic="http://schemas.openxmlformats.org/drawingml/2006/picture">
             <wp:extent cx="5303520" cy="3241040"/>
-            <wp:docPr id="3" name="Picture 3"/>
+            <wp:docPr id="6" name="Picture 6"/>
             <wp:cNvGraphicFramePr>
               <a:graphicFrameLocks noChangeAspect="1"/>
             </wp:cNvGraphicFramePr>
@@ -3313,7 +4783,7 @@
                     <pic:cNvPicPr/>
                   </pic:nvPicPr>
                   <pic:blipFill>
-                    <a:blip r:embed="rId11"/>
+                    <a:blip r:embed="rId14"/>
                     <a:stretch>
                       <a:fillRect/>
                     </a:stretch>

</xml_diff>